<commit_message>
Add skills-lock.json and backup reference document
- Created a new skills-lock.json file to manage skill dependencies, including the paper-formatter skill from GitHub.
- Added a backup of the reference document (reference.docx.bak) containing binary data.
</commit_message>
<xml_diff>
--- a/templates/reference.docx
+++ b/templates/reference.docx
@@ -1,6 +1,6 @@
 
 <file path=word/document.xml><?xml version="1.0" encoding="utf-8"?>
-<w:document xmlns:r="http://schemas.openxmlformats.org/officeDocument/2006/relationships" xmlns:w="http://schemas.openxmlformats.org/wordprocessingml/2006/main">
+<w:document xmlns:w="http://schemas.openxmlformats.org/wordprocessingml/2006/main" xmlns:m="http://schemas.openxmlformats.org/officeDocument/2006/math" xmlns:r="http://schemas.openxmlformats.org/officeDocument/2006/relationships" xmlns:o="urn:schemas-microsoft-com:office:office" xmlns:v="urn:schemas-microsoft-com:vml" xmlns:w10="urn:schemas-microsoft-com:office:word" xmlns:a="http://schemas.openxmlformats.org/drawingml/2006/main" xmlns:pic="http://schemas.openxmlformats.org/drawingml/2006/picture" xmlns:wp="http://schemas.openxmlformats.org/drawingml/2006/wordprocessingDrawing">
   <w:body>
     <w:p>
       <w:pPr>
@@ -314,12 +314,9 @@
       </w:r>
     </w:p>
     <w:sectPr>
-      <w:footerReference w:type="default" r:id="rId9"/>
       <w:footnotePr>
         <w:numRestart w:val="eachSect"/>
       </w:footnotePr>
-      <w:pgSz w:w="11906" w:h="16838"/>
-      <w:pgMar w:top="1417" w:bottom="1417" w:left="1531" w:right="1531"/>
     </w:sectPr>
   </w:body>
 </w:document>
@@ -330,30 +327,29 @@
 </file>
 
 <file path=word/footer1.xml><?xml version="1.0" encoding="utf-8"?>
-<w:ftr xmlns:m="http://schemas.openxmlformats.org/officeDocument/2006/math" xmlns:mc="http://schemas.openxmlformats.org/markup-compatibility/2006" xmlns:mo="http://schemas.microsoft.com/office/mac/office/2008/main" xmlns:mv="urn:schemas-microsoft-com:mac:vml" xmlns:o="urn:schemas-microsoft-com:office:office" xmlns:r="http://schemas.openxmlformats.org/officeDocument/2006/relationships" xmlns:v="urn:schemas-microsoft-com:vml" xmlns:w10="urn:schemas-microsoft-com:office:word" xmlns:w14="http://schemas.microsoft.com/office/word/2010/wordml" xmlns:w="http://schemas.openxmlformats.org/wordprocessingml/2006/main" xmlns:wne="http://schemas.microsoft.com/office/word/2006/wordml" xmlns:wp14="http://schemas.microsoft.com/office/word/2010/wordprocessingDrawing" xmlns:wp="http://schemas.openxmlformats.org/drawingml/2006/wordprocessingDrawing" xmlns:wpc="http://schemas.microsoft.com/office/word/2010/wordprocessingCanvas" xmlns:wpg="http://schemas.microsoft.com/office/word/2010/wordprocessingGroup" xmlns:wpi="http://schemas.microsoft.com/office/word/2010/wordprocessingInk" xmlns:wps="http://schemas.microsoft.com/office/word/2010/wordprocessingShape" mc:Ignorable="w14 wp14">
+<w:ftr xmlns:w="http://schemas.openxmlformats.org/wordprocessingml/2006/main">
   <w:p>
     <w:pPr>
-      <w:pStyle w:val="Footer"/>
       <w:jc w:val="center"/>
     </w:pPr>
     <w:r>
       <w:rPr>
         <w:rFonts w:ascii="Times New Roman" w:hAnsi="Times New Roman"/>
-        <w:sz w:val="16"/>
+        <w:sz w:val="21"/>
       </w:rPr>
       <w:fldChar w:fldCharType="begin"/>
     </w:r>
     <w:r>
       <w:rPr>
         <w:rFonts w:ascii="Times New Roman" w:hAnsi="Times New Roman"/>
-        <w:sz w:val="16"/>
+        <w:sz w:val="21"/>
       </w:rPr>
       <w:instrText xml:space="preserve"> PAGE </w:instrText>
     </w:r>
     <w:r>
       <w:rPr>
         <w:rFonts w:ascii="Times New Roman" w:hAnsi="Times New Roman"/>
-        <w:sz w:val="16"/>
+        <w:sz w:val="21"/>
       </w:rPr>
       <w:fldChar w:fldCharType="end"/>
     </w:r>
@@ -517,77 +513,6 @@
 
 <file path=word/styles.xml><?xml version="1.0" encoding="utf-8"?>
 <w:styles xmlns:w="http://schemas.openxmlformats.org/wordprocessingml/2006/main">
-  <w:style w:type="table" w:styleId="Table">
-    <w:name w:val="Table"/>
-    <w:uiPriority w:val="59"/>
-    <w:qFormat/>
-    <w:tblPr>
-      <w:tblW w:w="5000" w:type="pct"/>
-      <w:tblCellMar>
-        <w:top w:w="50" w:type="dxa"/>
-        <w:left w:w="108" w:type="dxa"/>
-        <w:bottom w:w="50" w:type="dxa"/>
-        <w:right w:w="108" w:type="dxa"/>
-      </w:tblCellMar>
-      <w:tblBorders>
-        <w:top w:val="single" w:sz="12" w:space="0" w:color="000000"/>
-        <w:bottom w:val="single" w:sz="12" w:space="0" w:color="000000"/>
-        <w:left w:val="none" w:sz="0" w:space="0" w:color="auto"/>
-        <w:right w:val="none" w:sz="0" w:space="0" w:color="auto"/>
-        <w:insideH w:val="none" w:sz="0" w:space="0" w:color="auto"/>
-        <w:insideV w:val="none" w:sz="0" w:space="0" w:color="auto"/>
-      </w:tblBorders>
-      <w:tblLook w:firstRow="1" w:lastRow="0" w:firstColumn="0" w:lastColumn="0" w:noHBand="1" w:noVBand="1" w:val="0020"/>
-    </w:tblPr>
-    <w:tblStylePr w:type="firstRow">
-      <w:rPr>
-        <w:b/>
-        <w:bCs w:val="true"/>
-        <w:sz w:val="21"/>
-        <w:szCs w:val="21"/>
-      </w:rPr>
-      <w:tcPr>
-        <w:tcBorders>
-          <w:bottom w:val="single" w:sz="6" w:space="0" w:color="000000"/>
-        </w:tcBorders>
-      </w:tcPr>
-    </w:tblStylePr>
-    <w:tblStylePr w:type="lastRow">
-      <w:tcPr>
-        <w:tcBorders>
-          <w:bottom w:val="single" w:sz="12" w:space="0" w:color="000000"/>
-        </w:tcBorders>
-      </w:tcPr>
-    </w:tblStylePr>
-  </w:style>
-  <w:style w:type="paragraph" w:styleId="SourceCode">
-    <w:name w:val="Source Code"/>
-    <w:basedOn w:val="Normal"/>
-    <w:link w:val="VerbatimChar"/>
-    <w:uiPriority w:val="29"/>
-    <w:qFormat/>
-    <w:rPr>
-      <w:rFonts w:ascii="Consolas" w:hAnsi="Consolas" w:eastAsia="SimSun" w:cs="Consolas"/>
-      <w:sz w:val="18"/>
-      <w:szCs w:val="18"/>
-      <w:color w:val="000000"/>
-    </w:rPr>
-    <w:pPr>
-      <w:ind w:left="0" w:right="0"/>
-      <w:wordWrap w:val="off"/>
-      <w:jc w:val="left"/>
-      <w:spacing w:line="240" w:lineRule="auto" w:before="0" w:after="0"/>
-    </w:pPr>
-  </w:style>
-  <w:style w:type="character" w:styleId="VerbatimChar">
-    <w:name w:val="Verbatim Char"/>
-    <w:basedOn w:val="DefaultParagraphFont"/>
-    <w:rPr>
-      <w:rFonts w:ascii="Consolas" w:hAnsi="Consolas" w:eastAsia="宋体" w:cs="Consolas"/>
-      <w:sz w:val="18"/>
-      <w:szCs w:val="18"/>
-    </w:rPr>
-  </w:style>
   <w:docDefaults>
     <w:rPrDefault>
       <w:rPr>
@@ -607,17 +532,17 @@
   <w:style w:type="paragraph" w:default="1" w:styleId="Normal">
     <w:name w:val="Normal"/>
     <w:qFormat/>
-    <w:pPr>
-      <w:ind w:firstLine="419"/>
+    <w:rPr>
+      <w:rFonts w:ascii="Times New Roman" w:hAnsi="Times New Roman" w:eastAsia="SimSun" w:cs="Times New Roman"/>
+      <w:sz w:val="24"/>
+      <w:szCs w:val="24"/>
+      <w:color w:val="000000"/>
+    </w:rPr>
+    <w:pPr>
       <w:jc w:val="both"/>
       <w:spacing w:line="300" w:lineRule="auto" w:before="0" w:after="0"/>
-    </w:pPr>
-    <w:rPr>
-      <w:rFonts w:ascii="Times New Roman" w:hAnsi="Times New Roman" w:eastAsia="SimSun" w:cs="Times New Roman"/>
-      <w:sz w:val="24"/>
-      <w:szCs w:val="24"/>
-      <w:color w:val="000000"/>
-    </w:rPr>
+      <w:ind w:firstLine="419"/>
+    </w:pPr>
   </w:style>
   <w:style w:type="paragraph" w:styleId="BodyText">
     <w:name w:val="Body Text"/>
@@ -625,9 +550,9 @@
     <w:link w:val="BodyTextChar"/>
     <w:qFormat/>
     <w:pPr>
-      <w:ind w:firstLine="419"/>
       <w:jc w:val="both"/>
       <w:spacing w:line="300" w:lineRule="auto" w:before="0" w:after="0"/>
+      <w:ind w:firstLine="419"/>
     </w:pPr>
     <w:rPr>
       <w:rFonts w:ascii="Times New Roman" w:hAnsi="Times New Roman" w:eastAsia="SimSun" w:cs="Times New Roman"/>
@@ -648,9 +573,9 @@
       <w:color w:val="000000"/>
     </w:rPr>
     <w:pPr>
-      <w:ind w:firstLine="419"/>
       <w:jc w:val="both"/>
       <w:spacing w:line="300" w:lineRule="auto" w:before="0" w:after="0"/>
+      <w:ind w:firstLine="419"/>
     </w:pPr>
   </w:style>
   <w:style w:type="paragraph" w:customStyle="1" w:styleId="Compact">
@@ -658,9 +583,9 @@
     <w:basedOn w:val="BodyText"/>
     <w:qFormat/>
     <w:pPr>
-      <w:ind/>
       <w:jc w:val="both"/>
       <w:spacing w:line="300" w:lineRule="auto" w:before="0" w:after="0"/>
+      <w:ind/>
     </w:pPr>
     <w:rPr>
       <w:rFonts w:ascii="Times New Roman" w:hAnsi="Times New Roman" w:eastAsia="SimSun" w:cs="Times New Roman"/>
@@ -679,12 +604,12 @@
     <w:rsid w:val="00A10FD9"/>
     <w:pPr>
       <w:contextualSpacing/>
-      <w:ind/>
       <w:jc w:val="center"/>
       <w:spacing w:line="360" w:lineRule="auto" w:before="240" w:after="120"/>
-    </w:pPr>
-    <w:rPr>
-      <w:rFonts w:asciiTheme="majorHAnsi" w:eastAsiaTheme="majorEastAsia" w:hAnsiTheme="majorHAnsi" w:cstheme="majorBidi" w:ascii="Times New Roman" w:hAnsi="Times New Roman" w:eastAsia="SimHei" w:cs="Times New Roman"/>
+      <w:ind/>
+    </w:pPr>
+    <w:rPr>
+      <w:rFonts w:ascii="Times New Roman" w:hAnsi="Times New Roman" w:eastAsia="SimHei" w:cs="Times New Roman"/>
       <w:sz w:val="32"/>
       <w:szCs w:val="32"/>
       <w:b/>
@@ -699,13 +624,14 @@
     <w:uiPriority w:val="10"/>
     <w:rsid w:val="00A10FD9"/>
     <w:rPr>
-      <w:rFonts w:asciiTheme="majorHAnsi" w:eastAsiaTheme="majorEastAsia" w:hAnsiTheme="majorHAnsi" w:cstheme="majorBidi" w:ascii="Times New Roman" w:hAnsi="Times New Roman" w:eastAsia="SimHei" w:cs="Times New Roman"/>
+      <w:rFonts w:ascii="Times New Roman" w:hAnsi="Times New Roman" w:eastAsia="SimHei" w:cs="Times New Roman"/>
       <w:sz w:val="32"/>
       <w:szCs w:val="32"/>
       <w:b/>
       <w:bCs w:val="true"/>
       <w:color w:val="000000"/>
     </w:rPr>
+    <w:pPr/>
   </w:style>
   <w:style w:type="paragraph" w:styleId="Subtitle">
     <w:name w:val="Subtitle"/>
@@ -719,12 +645,12 @@
       <w:numPr>
         <w:ilvl w:val="1"/>
       </w:numPr>
-      <w:ind/>
       <w:jc w:val="center"/>
       <w:spacing w:line="300" w:lineRule="auto" w:before="0" w:after="120"/>
-    </w:pPr>
-    <w:rPr>
-      <w:rFonts w:eastAsiaTheme="majorEastAsia" w:cstheme="majorBidi" w:ascii="Times New Roman" w:hAnsi="Times New Roman" w:eastAsia="SimHei" w:cs="Times New Roman"/>
+      <w:ind/>
+    </w:pPr>
+    <w:rPr>
+      <w:rFonts w:ascii="Times New Roman" w:hAnsi="Times New Roman" w:eastAsia="SimHei" w:cs="Times New Roman"/>
       <w:spacing w:val="15"/>
       <w:sz w:val="28"/>
       <w:szCs w:val="28"/>
@@ -738,12 +664,13 @@
     <w:uiPriority w:val="11"/>
     <w:rsid w:val="00A10FD9"/>
     <w:rPr>
-      <w:rFonts w:eastAsiaTheme="majorEastAsia" w:cstheme="majorBidi" w:ascii="Times New Roman" w:hAnsi="Times New Roman" w:eastAsia="SimHei" w:cs="Times New Roman"/>
+      <w:rFonts w:ascii="Times New Roman" w:hAnsi="Times New Roman" w:eastAsia="SimHei" w:cs="Times New Roman"/>
       <w:spacing w:val="15"/>
       <w:sz w:val="28"/>
       <w:szCs w:val="28"/>
       <w:color w:val="000000"/>
     </w:rPr>
+    <w:pPr/>
   </w:style>
   <w:style w:type="paragraph" w:customStyle="1" w:styleId="Author">
     <w:name w:val="Author"/>
@@ -751,11 +678,9 @@
     <w:next w:val="BodyText"/>
     <w:qFormat/>
     <w:pPr>
-      <w:keepNext/>
-      <w:keepLines/>
-      <w:ind/>
       <w:jc w:val="center"/>
       <w:spacing w:line="300" w:lineRule="auto" w:before="0" w:after="0"/>
+      <w:ind/>
     </w:pPr>
     <w:rPr>
       <w:rFonts w:ascii="Times New Roman" w:hAnsi="Times New Roman" w:eastAsia="SimSun" w:cs="Times New Roman"/>
@@ -770,68 +695,58 @@
     <w:next w:val="BodyText"/>
     <w:qFormat/>
     <w:pPr>
+      <w:jc w:val="center"/>
+      <w:spacing w:line="300" w:lineRule="auto" w:before="0" w:after="0"/>
+      <w:ind/>
+    </w:pPr>
+    <w:rPr>
+      <w:rFonts w:ascii="Times New Roman" w:hAnsi="Times New Roman" w:eastAsia="SimSun" w:cs="Times New Roman"/>
+      <w:sz w:val="24"/>
+      <w:szCs w:val="24"/>
+      <w:color w:val="000000"/>
+    </w:rPr>
+  </w:style>
+  <w:style w:type="paragraph" w:customStyle="1" w:styleId="AbstractTitle">
+    <w:name w:val="Abstract Title"/>
+    <w:basedOn w:val="Normal"/>
+    <w:next w:val="Abstract"/>
+    <w:qFormat/>
+    <w:pPr>
       <w:keepNext/>
       <w:keepLines/>
-      <w:ind/>
+      <w:spacing w:before="300" w:after="0"/>
       <w:jc w:val="center"/>
-      <w:spacing w:line="300" w:lineRule="auto" w:before="0" w:after="0"/>
-    </w:pPr>
-    <w:rPr>
-      <w:rFonts w:ascii="Times New Roman" w:hAnsi="Times New Roman" w:eastAsia="SimSun" w:cs="Times New Roman"/>
-      <w:sz w:val="24"/>
-      <w:szCs w:val="24"/>
-      <w:color w:val="000000"/>
-    </w:rPr>
-  </w:style>
-  <w:style w:type="paragraph" w:customStyle="1" w:styleId="AbstractTitle">
-    <w:name w:val="Abstract Title"/>
-    <w:basedOn w:val="Normal"/>
-    <w:next w:val="Abstract"/>
+    </w:pPr>
+    <w:rPr>
+      <w:b/>
+      <w:sz w:val="20"/>
+      <w:szCs w:val="20"/>
+    </w:rPr>
+  </w:style>
+  <w:style w:type="paragraph" w:customStyle="1" w:styleId="Abstract">
+    <w:name w:val="Abstract"/>
+    <w:basedOn w:val="Normal"/>
+    <w:next w:val="BodyText"/>
     <w:qFormat/>
     <w:pPr>
       <w:keepNext/>
       <w:keepLines/>
-      <w:ind/>
-      <w:jc w:val="center"/>
-      <w:spacing w:line="300" w:lineRule="auto" w:before="120" w:after="120"/>
-    </w:pPr>
-    <w:rPr>
-      <w:rFonts w:ascii="Times New Roman" w:hAnsi="Times New Roman" w:eastAsia="SimHei" w:cs="Times New Roman"/>
-      <w:sz w:val="28"/>
-      <w:szCs w:val="28"/>
-      <w:b/>
-      <w:bCs w:val="true"/>
-      <w:color w:val="000000"/>
-    </w:rPr>
-  </w:style>
-  <w:style w:type="paragraph" w:customStyle="1" w:styleId="Abstract">
-    <w:name w:val="Abstract"/>
-    <w:basedOn w:val="Normal"/>
-    <w:next w:val="BodyText"/>
-    <w:qFormat/>
-    <w:pPr>
-      <w:keepNext/>
-      <w:keepLines/>
-      <w:ind w:firstLine="419"/>
+      <w:spacing w:before="100" w:after="300"/>
+    </w:pPr>
+    <w:rPr>
+      <w:sz w:val="20"/>
+      <w:szCs w:val="20"/>
+    </w:rPr>
+  </w:style>
+  <w:style w:type="paragraph" w:styleId="Bibliography">
+    <w:name w:val="Bibliography"/>
+    <w:basedOn w:val="Normal"/>
+    <w:next w:val="Bibliography"/>
+    <w:qFormat/>
+    <w:pPr>
       <w:jc w:val="both"/>
       <w:spacing w:line="300" w:lineRule="auto" w:before="0" w:after="0"/>
-    </w:pPr>
-    <w:rPr>
-      <w:rFonts w:ascii="Times New Roman" w:hAnsi="Times New Roman" w:eastAsia="SimSun" w:cs="Times New Roman"/>
-      <w:sz w:val="24"/>
-      <w:szCs w:val="24"/>
-      <w:color w:val="000000"/>
-    </w:rPr>
-  </w:style>
-  <w:style w:type="paragraph" w:styleId="Bibliography">
-    <w:name w:val="Bibliography"/>
-    <w:basedOn w:val="Normal"/>
-    <w:next w:val="Bibliography"/>
-    <w:qFormat/>
-    <w:pPr>
-      <w:ind/>
-      <w:jc w:val="both"/>
-      <w:spacing w:line="300" w:lineRule="auto" w:before="0" w:after="0"/>
+      <w:ind/>
     </w:pPr>
     <w:rPr>
       <w:rFonts w:ascii="Times New Roman" w:hAnsi="Times New Roman" w:eastAsia="SimSun" w:cs="Times New Roman"/>
@@ -849,15 +764,13 @@
     <w:qFormat/>
     <w:rsid w:val="00A10FD9"/>
     <w:pPr>
-      <w:keepNext/>
-      <w:keepLines/>
       <w:outlineLvl w:val="0"/>
-      <w:ind/>
       <w:jc w:val="center"/>
       <w:spacing w:line="360" w:lineRule="auto" w:before="240" w:after="120"/>
-    </w:pPr>
-    <w:rPr>
-      <w:rFonts w:asciiTheme="majorHAnsi" w:eastAsiaTheme="majorEastAsia" w:hAnsiTheme="majorHAnsi" w:cstheme="majorBidi" w:ascii="Times New Roman" w:hAnsi="Times New Roman" w:eastAsia="SimHei" w:cs="Times New Roman"/>
+      <w:ind/>
+    </w:pPr>
+    <w:rPr>
+      <w:rFonts w:ascii="Times New Roman" w:hAnsi="Times New Roman" w:eastAsia="SimHei" w:cs="Times New Roman"/>
       <w:sz w:val="28"/>
       <w:szCs w:val="28"/>
       <w:b/>
@@ -876,17 +789,15 @@
     <w:qFormat/>
     <w:rsid w:val="00A10FD9"/>
     <w:pPr>
-      <w:keepNext/>
-      <w:keepLines/>
       <w:outlineLvl w:val="1"/>
-      <w:ind/>
       <w:jc w:val="left"/>
       <w:spacing w:line="360" w:lineRule="auto" w:before="160" w:after="80"/>
-    </w:pPr>
-    <w:rPr>
-      <w:rFonts w:asciiTheme="majorHAnsi" w:eastAsiaTheme="majorEastAsia" w:hAnsiTheme="majorHAnsi" w:cstheme="majorBidi" w:ascii="Times New Roman" w:hAnsi="Times New Roman" w:eastAsia="SimHei" w:cs="Times New Roman"/>
-      <w:sz w:val="26"/>
-      <w:szCs w:val="26"/>
+      <w:ind/>
+    </w:pPr>
+    <w:rPr>
+      <w:rFonts w:ascii="Times New Roman" w:hAnsi="Times New Roman" w:eastAsia="SimHei" w:cs="Times New Roman"/>
+      <w:sz w:val="24"/>
+      <w:szCs w:val="24"/>
       <w:b/>
       <w:bCs w:val="true"/>
       <w:color w:val="000000"/>
@@ -903,15 +814,13 @@
     <w:qFormat/>
     <w:rsid w:val="00A10FD9"/>
     <w:pPr>
-      <w:keepNext/>
-      <w:keepLines/>
       <w:outlineLvl w:val="2"/>
-      <w:ind/>
       <w:jc w:val="left"/>
       <w:spacing w:line="300" w:lineRule="auto" w:before="120" w:after="60"/>
-    </w:pPr>
-    <w:rPr>
-      <w:rFonts w:eastAsiaTheme="majorEastAsia" w:cstheme="majorBidi" w:ascii="Times New Roman" w:hAnsi="Times New Roman" w:eastAsia="SimHei" w:cs="Times New Roman"/>
+      <w:ind/>
+    </w:pPr>
+    <w:rPr>
+      <w:rFonts w:ascii="Times New Roman" w:hAnsi="Times New Roman" w:eastAsia="SimHei" w:cs="Times New Roman"/>
       <w:sz w:val="24"/>
       <w:szCs w:val="24"/>
       <w:b/>
@@ -930,15 +839,13 @@
     <w:qFormat/>
     <w:rsid w:val="00A10FD9"/>
     <w:pPr>
-      <w:keepNext/>
-      <w:keepLines/>
       <w:outlineLvl w:val="3"/>
-      <w:ind/>
       <w:jc w:val="left"/>
       <w:spacing w:line="240" w:lineRule="auto" w:before="120" w:after="60"/>
-    </w:pPr>
-    <w:rPr>
-      <w:rFonts w:eastAsiaTheme="majorEastAsia" w:cstheme="majorBidi" w:ascii="Times New Roman" w:hAnsi="Times New Roman" w:eastAsia="SimHei" w:cs="Times New Roman"/>
+      <w:ind/>
+    </w:pPr>
+    <w:rPr>
+      <w:rFonts w:ascii="Times New Roman" w:hAnsi="Times New Roman" w:eastAsia="SimHei" w:cs="Times New Roman"/>
       <w:i/>
       <w:iCs/>
       <w:sz w:val="24"/>
@@ -959,15 +866,13 @@
     <w:qFormat/>
     <w:rsid w:val="00A10FD9"/>
     <w:pPr>
-      <w:keepNext/>
-      <w:keepLines/>
       <w:outlineLvl w:val="4"/>
-      <w:ind/>
       <w:jc w:val="left"/>
       <w:spacing w:line="240" w:lineRule="auto" w:before="120" w:after="60"/>
-    </w:pPr>
-    <w:rPr>
-      <w:rFonts w:eastAsiaTheme="majorEastAsia" w:cstheme="majorBidi" w:ascii="Times New Roman" w:hAnsi="Times New Roman" w:eastAsia="SimHei" w:cs="Times New Roman"/>
+      <w:ind/>
+    </w:pPr>
+    <w:rPr>
+      <w:rFonts w:ascii="Times New Roman" w:hAnsi="Times New Roman" w:eastAsia="SimHei" w:cs="Times New Roman"/>
       <w:sz w:val="24"/>
       <w:szCs w:val="24"/>
       <w:b/>
@@ -986,15 +891,13 @@
     <w:qFormat/>
     <w:rsid w:val="00A10FD9"/>
     <w:pPr>
-      <w:keepNext/>
-      <w:keepLines/>
       <w:outlineLvl w:val="5"/>
-      <w:ind/>
       <w:jc w:val="left"/>
       <w:spacing w:line="240" w:lineRule="auto" w:before="120" w:after="60"/>
-    </w:pPr>
-    <w:rPr>
-      <w:rFonts w:eastAsiaTheme="majorEastAsia" w:cstheme="majorBidi" w:ascii="Times New Roman" w:hAnsi="Times New Roman" w:eastAsia="SimHei" w:cs="Times New Roman"/>
+      <w:ind/>
+    </w:pPr>
+    <w:rPr>
+      <w:rFonts w:ascii="Times New Roman" w:hAnsi="Times New Roman" w:eastAsia="SimHei" w:cs="Times New Roman"/>
       <w:i/>
       <w:iCs/>
       <w:sz w:val="24"/>
@@ -1015,15 +918,13 @@
     <w:qFormat/>
     <w:rsid w:val="00A10FD9"/>
     <w:pPr>
-      <w:keepNext/>
-      <w:keepLines/>
       <w:outlineLvl w:val="6"/>
-      <w:ind/>
       <w:jc w:val="left"/>
       <w:spacing w:line="240" w:lineRule="auto" w:before="120" w:after="60"/>
-    </w:pPr>
-    <w:rPr>
-      <w:rFonts w:eastAsiaTheme="majorEastAsia" w:cstheme="majorBidi" w:ascii="Times New Roman" w:hAnsi="Times New Roman" w:eastAsia="SimHei" w:cs="Times New Roman"/>
+      <w:ind/>
+    </w:pPr>
+    <w:rPr>
+      <w:rFonts w:ascii="Times New Roman" w:hAnsi="Times New Roman" w:eastAsia="SimHei" w:cs="Times New Roman"/>
       <w:sz w:val="24"/>
       <w:szCs w:val="24"/>
       <w:b/>
@@ -1042,15 +943,13 @@
     <w:qFormat/>
     <w:rsid w:val="00A10FD9"/>
     <w:pPr>
-      <w:keepNext/>
-      <w:keepLines/>
       <w:outlineLvl w:val="7"/>
-      <w:ind/>
       <w:jc w:val="left"/>
       <w:spacing w:line="240" w:lineRule="auto" w:before="120" w:after="60"/>
-    </w:pPr>
-    <w:rPr>
-      <w:rFonts w:eastAsiaTheme="majorEastAsia" w:cstheme="majorBidi" w:ascii="Times New Roman" w:hAnsi="Times New Roman" w:eastAsia="SimHei" w:cs="Times New Roman"/>
+      <w:ind/>
+    </w:pPr>
+    <w:rPr>
+      <w:rFonts w:ascii="Times New Roman" w:hAnsi="Times New Roman" w:eastAsia="SimHei" w:cs="Times New Roman"/>
       <w:i/>
       <w:iCs/>
       <w:sz w:val="24"/>
@@ -1071,15 +970,13 @@
     <w:qFormat/>
     <w:rsid w:val="00A10FD9"/>
     <w:pPr>
-      <w:keepNext/>
-      <w:keepLines/>
       <w:outlineLvl w:val="8"/>
-      <w:ind/>
       <w:jc w:val="left"/>
       <w:spacing w:line="240" w:lineRule="auto" w:before="120" w:after="60"/>
-    </w:pPr>
-    <w:rPr>
-      <w:rFonts w:eastAsiaTheme="majorEastAsia" w:cstheme="majorBidi" w:ascii="Times New Roman" w:hAnsi="Times New Roman" w:eastAsia="SimHei" w:cs="Times New Roman"/>
+      <w:ind/>
+    </w:pPr>
+    <w:rPr>
+      <w:rFonts w:ascii="Times New Roman" w:hAnsi="Times New Roman" w:eastAsia="SimHei" w:cs="Times New Roman"/>
       <w:sz w:val="24"/>
       <w:szCs w:val="24"/>
       <w:b/>
@@ -1094,13 +991,14 @@
     <w:uiPriority w:val="9"/>
     <w:rsid w:val="00A10FD9"/>
     <w:rPr>
-      <w:rFonts w:asciiTheme="majorHAnsi" w:eastAsiaTheme="majorEastAsia" w:hAnsiTheme="majorHAnsi" w:cstheme="majorBidi" w:ascii="Times New Roman" w:hAnsi="Times New Roman" w:eastAsia="SimHei" w:cs="Times New Roman"/>
+      <w:rFonts w:ascii="Times New Roman" w:hAnsi="Times New Roman" w:eastAsia="SimHei" w:cs="Times New Roman"/>
       <w:sz w:val="28"/>
       <w:szCs w:val="28"/>
       <w:b/>
       <w:bCs w:val="true"/>
       <w:color w:val="000000"/>
     </w:rPr>
+    <w:pPr/>
   </w:style>
   <w:style w:type="character" w:customStyle="1" w:styleId="Heading2Char">
     <w:name w:val="Heading 2 Char"/>
@@ -1110,13 +1008,14 @@
     <w:semiHidden/>
     <w:rsid w:val="00A10FD9"/>
     <w:rPr>
-      <w:rFonts w:asciiTheme="majorHAnsi" w:eastAsiaTheme="majorEastAsia" w:hAnsiTheme="majorHAnsi" w:cstheme="majorBidi" w:ascii="Times New Roman" w:hAnsi="Times New Roman" w:eastAsia="SimHei" w:cs="Times New Roman"/>
-      <w:sz w:val="26"/>
-      <w:szCs w:val="26"/>
-      <w:b/>
-      <w:bCs w:val="true"/>
-      <w:color w:val="000000"/>
-    </w:rPr>
+      <w:rFonts w:ascii="Times New Roman" w:hAnsi="Times New Roman" w:eastAsia="SimHei" w:cs="Times New Roman"/>
+      <w:sz w:val="24"/>
+      <w:szCs w:val="24"/>
+      <w:b/>
+      <w:bCs w:val="true"/>
+      <w:color w:val="000000"/>
+    </w:rPr>
+    <w:pPr/>
   </w:style>
   <w:style w:type="character" w:customStyle="1" w:styleId="Heading3Char">
     <w:name w:val="Heading 3 Char"/>
@@ -1126,13 +1025,14 @@
     <w:semiHidden/>
     <w:rsid w:val="00A10FD9"/>
     <w:rPr>
-      <w:rFonts w:eastAsiaTheme="majorEastAsia" w:cstheme="majorBidi" w:ascii="Times New Roman" w:hAnsi="Times New Roman" w:eastAsia="SimHei" w:cs="Times New Roman"/>
-      <w:sz w:val="24"/>
-      <w:szCs w:val="24"/>
-      <w:b/>
-      <w:bCs w:val="true"/>
-      <w:color w:val="000000"/>
-    </w:rPr>
+      <w:rFonts w:ascii="Times New Roman" w:hAnsi="Times New Roman" w:eastAsia="SimHei" w:cs="Times New Roman"/>
+      <w:sz w:val="24"/>
+      <w:szCs w:val="24"/>
+      <w:b/>
+      <w:bCs w:val="true"/>
+      <w:color w:val="000000"/>
+    </w:rPr>
+    <w:pPr/>
   </w:style>
   <w:style w:type="character" w:customStyle="1" w:styleId="Heading4Char">
     <w:name w:val="Heading 4 Char"/>
@@ -1142,7 +1042,7 @@
     <w:semiHidden/>
     <w:rsid w:val="00A10FD9"/>
     <w:rPr>
-      <w:rFonts w:eastAsiaTheme="majorEastAsia" w:cstheme="majorBidi" w:ascii="Times New Roman" w:hAnsi="Times New Roman" w:eastAsia="SimHei" w:cs="Times New Roman"/>
+      <w:rFonts w:ascii="Times New Roman" w:hAnsi="Times New Roman" w:eastAsia="SimHei" w:cs="Times New Roman"/>
       <w:i/>
       <w:iCs/>
       <w:sz w:val="24"/>
@@ -1151,6 +1051,7 @@
       <w:bCs w:val="true"/>
       <w:color w:val="000000"/>
     </w:rPr>
+    <w:pPr/>
   </w:style>
   <w:style w:type="character" w:customStyle="1" w:styleId="Heading5Char">
     <w:name w:val="Heading 5 Char"/>
@@ -1160,13 +1061,14 @@
     <w:semiHidden/>
     <w:rsid w:val="00A10FD9"/>
     <w:rPr>
-      <w:rFonts w:eastAsiaTheme="majorEastAsia" w:cstheme="majorBidi" w:ascii="Times New Roman" w:hAnsi="Times New Roman" w:eastAsia="SimHei" w:cs="Times New Roman"/>
-      <w:sz w:val="24"/>
-      <w:szCs w:val="24"/>
-      <w:b/>
-      <w:bCs w:val="true"/>
-      <w:color w:val="000000"/>
-    </w:rPr>
+      <w:rFonts w:ascii="Times New Roman" w:hAnsi="Times New Roman" w:eastAsia="SimHei" w:cs="Times New Roman"/>
+      <w:sz w:val="24"/>
+      <w:szCs w:val="24"/>
+      <w:b/>
+      <w:bCs w:val="true"/>
+      <w:color w:val="000000"/>
+    </w:rPr>
+    <w:pPr/>
   </w:style>
   <w:style w:type="character" w:customStyle="1" w:styleId="Heading6Char">
     <w:name w:val="Heading 6 Char"/>
@@ -1176,7 +1078,7 @@
     <w:semiHidden/>
     <w:rsid w:val="00A10FD9"/>
     <w:rPr>
-      <w:rFonts w:eastAsiaTheme="majorEastAsia" w:cstheme="majorBidi" w:ascii="Times New Roman" w:hAnsi="Times New Roman" w:eastAsia="SimHei" w:cs="Times New Roman"/>
+      <w:rFonts w:ascii="Times New Roman" w:hAnsi="Times New Roman" w:eastAsia="SimHei" w:cs="Times New Roman"/>
       <w:i/>
       <w:iCs/>
       <w:sz w:val="24"/>
@@ -1185,6 +1087,7 @@
       <w:bCs w:val="true"/>
       <w:color w:val="000000"/>
     </w:rPr>
+    <w:pPr/>
   </w:style>
   <w:style w:type="character" w:customStyle="1" w:styleId="Heading7Char">
     <w:name w:val="Heading 7 Char"/>
@@ -1194,13 +1097,14 @@
     <w:semiHidden/>
     <w:rsid w:val="00A10FD9"/>
     <w:rPr>
-      <w:rFonts w:eastAsiaTheme="majorEastAsia" w:cstheme="majorBidi" w:ascii="Times New Roman" w:hAnsi="Times New Roman" w:eastAsia="SimHei" w:cs="Times New Roman"/>
-      <w:sz w:val="24"/>
-      <w:szCs w:val="24"/>
-      <w:b/>
-      <w:bCs w:val="true"/>
-      <w:color w:val="000000"/>
-    </w:rPr>
+      <w:rFonts w:ascii="Times New Roman" w:hAnsi="Times New Roman" w:eastAsia="SimHei" w:cs="Times New Roman"/>
+      <w:sz w:val="24"/>
+      <w:szCs w:val="24"/>
+      <w:b/>
+      <w:bCs w:val="true"/>
+      <w:color w:val="000000"/>
+    </w:rPr>
+    <w:pPr/>
   </w:style>
   <w:style w:type="character" w:customStyle="1" w:styleId="Heading8Char">
     <w:name w:val="Heading 8 Char"/>
@@ -1210,7 +1114,7 @@
     <w:semiHidden/>
     <w:rsid w:val="00A10FD9"/>
     <w:rPr>
-      <w:rFonts w:eastAsiaTheme="majorEastAsia" w:cstheme="majorBidi" w:ascii="Times New Roman" w:hAnsi="Times New Roman" w:eastAsia="SimHei" w:cs="Times New Roman"/>
+      <w:rFonts w:ascii="Times New Roman" w:hAnsi="Times New Roman" w:eastAsia="SimHei" w:cs="Times New Roman"/>
       <w:i/>
       <w:iCs/>
       <w:sz w:val="24"/>
@@ -1219,6 +1123,7 @@
       <w:bCs w:val="true"/>
       <w:color w:val="000000"/>
     </w:rPr>
+    <w:pPr/>
   </w:style>
   <w:style w:type="character" w:customStyle="1" w:styleId="Heading9Char">
     <w:name w:val="Heading 9 Char"/>
@@ -1228,13 +1133,14 @@
     <w:semiHidden/>
     <w:rsid w:val="00A10FD9"/>
     <w:rPr>
-      <w:rFonts w:eastAsiaTheme="majorEastAsia" w:cstheme="majorBidi" w:ascii="Times New Roman" w:hAnsi="Times New Roman" w:eastAsia="SimHei" w:cs="Times New Roman"/>
-      <w:sz w:val="24"/>
-      <w:szCs w:val="24"/>
-      <w:b/>
-      <w:bCs w:val="true"/>
-      <w:color w:val="000000"/>
-    </w:rPr>
+      <w:rFonts w:ascii="Times New Roman" w:hAnsi="Times New Roman" w:eastAsia="SimHei" w:cs="Times New Roman"/>
+      <w:sz w:val="24"/>
+      <w:szCs w:val="24"/>
+      <w:b/>
+      <w:bCs w:val="true"/>
+      <w:color w:val="000000"/>
+    </w:rPr>
+    <w:pPr/>
   </w:style>
   <w:style w:type="paragraph" w:styleId="BlockText">
     <w:name w:val="Block Text"/>
@@ -1262,17 +1168,6 @@
     <w:uiPriority w:val="9"/>
     <w:unhideWhenUsed/>
     <w:qFormat/>
-    <w:rPr>
-      <w:rFonts w:ascii="Times New Roman" w:hAnsi="Times New Roman" w:eastAsia="SimSun" w:cs="Times New Roman"/>
-      <w:sz w:val="18"/>
-      <w:szCs w:val="18"/>
-      <w:color w:val="000000"/>
-    </w:rPr>
-    <w:pPr>
-      <w:ind/>
-      <w:jc w:val="left"/>
-      <w:spacing w:line="240" w:lineRule="auto" w:before="0" w:after="0"/>
-    </w:pPr>
   </w:style>
   <w:style w:type="paragraph" w:styleId="FootnoteBlockText">
     <w:name w:val="Footnote Block Text"/>
@@ -1313,13 +1208,13 @@
     <w:basedOn w:val="Normal"/>
     <w:link w:val="BodyTextChar"/>
     <w:pPr>
-      <w:ind/>
       <w:jc w:val="center"/>
       <w:spacing w:line="300" w:lineRule="auto" w:before="120" w:after="60"/>
-    </w:pPr>
-    <w:rPr>
+      <w:ind/>
+    </w:pPr>
+    <w:rPr>
+      <w:i/>
       <w:rFonts w:ascii="Times New Roman" w:hAnsi="Times New Roman" w:eastAsia="SimSun" w:cs="Times New Roman"/>
-      <w:i/>
       <w:sz w:val="21"/>
       <w:szCs w:val="21"/>
       <w:b/>
@@ -1331,10 +1226,9 @@
     <w:name w:val="Table Caption"/>
     <w:basedOn w:val="Caption"/>
     <w:pPr>
-      <w:keepNext/>
-      <w:ind/>
       <w:jc w:val="center"/>
       <w:spacing w:line="300" w:lineRule="auto" w:before="120" w:after="60"/>
+      <w:ind/>
     </w:pPr>
     <w:rPr>
       <w:rFonts w:ascii="Times New Roman" w:hAnsi="Times New Roman" w:eastAsia="SimSun" w:cs="Times New Roman"/>
@@ -1348,11 +1242,6 @@
   <w:style w:type="paragraph" w:customStyle="1" w:styleId="ImageCaption">
     <w:name w:val="Image Caption"/>
     <w:basedOn w:val="Caption"/>
-    <w:pPr>
-      <w:ind/>
-      <w:jc w:val="center"/>
-      <w:spacing w:line="300" w:lineRule="auto" w:before="120" w:after="60"/>
-    </w:pPr>
     <w:rPr>
       <w:rFonts w:ascii="Times New Roman" w:hAnsi="Times New Roman" w:eastAsia="SimSun" w:cs="Times New Roman"/>
       <w:sz w:val="21"/>
@@ -1361,6 +1250,11 @@
       <w:bCs w:val="true"/>
       <w:color w:val="000000"/>
     </w:rPr>
+    <w:pPr>
+      <w:jc w:val="center"/>
+      <w:spacing w:line="300" w:lineRule="auto" w:before="120" w:after="60"/>
+      <w:ind/>
+    </w:pPr>
   </w:style>
   <w:style w:type="paragraph" w:customStyle="1" w:styleId="Figure">
     <w:name w:val="Figure"/>
@@ -1382,6 +1276,15 @@
       <w:sz w:val="24"/>
       <w:szCs w:val="24"/>
       <w:color w:val="000000"/>
+    </w:rPr>
+    <w:pPr/>
+  </w:style>
+  <w:style w:type="character" w:customStyle="1" w:styleId="VerbatimChar">
+    <w:name w:val="Verbatim Char"/>
+    <w:basedOn w:val="BodyTextChar"/>
+    <w:rPr>
+      <w:rFonts w:ascii="Consolas" w:hAnsi="Consolas"/>
+      <w:sz w:val="22"/>
     </w:rPr>
   </w:style>
   <w:style w:type="character" w:customStyle="1" w:styleId="SectionNumber">
@@ -1410,19 +1313,41 @@
     <w:unhideWhenUsed/>
     <w:qFormat/>
     <w:pPr>
+      <w:spacing w:before="240" w:line="259" w:lineRule="auto"/>
       <w:outlineLvl w:val="9"/>
-      <w:ind/>
+    </w:pPr>
+    <w:rPr>
+      <w:rFonts w:asciiTheme="majorHAnsi" w:eastAsiaTheme="majorEastAsia" w:hAnsiTheme="majorHAnsi" w:cstheme="majorBidi"/>
+      <w:b w:val="0"/>
+      <w:bCs w:val="0"/>
+      <w:color w:val="365F91" w:themeColor="accent1" w:themeShade="BF"/>
+    </w:rPr>
+  </w:style>
+  <w:style w:type="table" w:styleId="Table">
+    <w:name w:val="Table"/>
+    <w:basedOn w:val="7"/>
+    <w:qFormat/>
+    <w:tblPr>
       <w:jc w:val="center"/>
-      <w:spacing w:line="360" w:lineRule="auto" w:before="240" w:after="120"/>
-    </w:pPr>
-    <w:rPr>
-      <w:rFonts w:asciiTheme="majorHAnsi" w:eastAsiaTheme="majorEastAsia" w:hAnsiTheme="majorHAnsi" w:cstheme="majorBidi" w:ascii="Times New Roman" w:hAnsi="Times New Roman" w:eastAsia="SimHei" w:cs="Times New Roman"/>
-      <w:sz w:val="28"/>
-      <w:szCs w:val="28"/>
-      <w:b/>
-      <w:bCs w:val="true"/>
-      <w:color w:val="000000"/>
-    </w:rPr>
+      <w:tblBorders>
+        <w:top w:val="single" w:sz="12" w:space="0" w:color="000000"/>
+        <w:bottom w:val="single" w:sz="12" w:space="0" w:color="000000"/>
+        <w:left w:val="none" w:sz="0" w:space="0" w:color="auto"/>
+        <w:right w:val="none" w:sz="0" w:space="0" w:color="auto"/>
+        <w:insideH w:val="none" w:sz="0" w:space="0" w:color="auto"/>
+        <w:insideV w:val="none" w:sz="0" w:space="0" w:color="auto"/>
+      </w:tblBorders>
+    </w:tblPr>
+    <w:tcPr>
+      <w:vAlign w:val="center"/>
+    </w:tcPr>
+    <w:tblStylePr w:type="firstRow">
+      <w:tcPr>
+        <w:tcBorders>
+          <w:bottom w:val="single" w:sz="6" w:space="0" w:color="000000"/>
+        </w:tcBorders>
+      </w:tcPr>
+    </w:tblStylePr>
   </w:style>
 </w:styles>
 </file>

</xml_diff>

<commit_message>
feat: Upgrade MathModel to v3.0 with enhanced features and documentation
- Updated README.md to reflect new version and improvements, including validation of 2026 AQI prediction task.
- Enhanced project structure descriptions and clarified figure and table requirements.
- Improved installation instructions by adding pandas to the required packages.
- Revised paper formatting guidelines to include new abstract structure and table formatting rules.
- Updated postprocess_appendix.py to fix table caption centering and column width adjustments.
- Added init_project.py for project initialization, including dependency checks and output directory setup.
- Revised wiki.md to reflect changes in workflow and added new guidelines for table rendering and reference verification.
</commit_message>
<xml_diff>
--- a/templates/reference.docx
+++ b/templates/reference.docx
@@ -539,9 +539,9 @@
       <w:color w:val="000000"/>
     </w:rPr>
     <w:pPr>
+      <w:ind w:firstLine="419"/>
       <w:jc w:val="both"/>
       <w:spacing w:line="300" w:lineRule="auto" w:before="0" w:after="0"/>
-      <w:ind w:firstLine="419"/>
     </w:pPr>
   </w:style>
   <w:style w:type="paragraph" w:styleId="BodyText">
@@ -550,9 +550,9 @@
     <w:link w:val="BodyTextChar"/>
     <w:qFormat/>
     <w:pPr>
+      <w:ind w:firstLine="419"/>
       <w:jc w:val="both"/>
       <w:spacing w:line="300" w:lineRule="auto" w:before="0" w:after="0"/>
-      <w:ind w:firstLine="419"/>
     </w:pPr>
     <w:rPr>
       <w:rFonts w:ascii="Times New Roman" w:hAnsi="Times New Roman" w:eastAsia="SimSun" w:cs="Times New Roman"/>
@@ -573,9 +573,9 @@
       <w:color w:val="000000"/>
     </w:rPr>
     <w:pPr>
+      <w:ind w:firstLine="419"/>
       <w:jc w:val="both"/>
       <w:spacing w:line="300" w:lineRule="auto" w:before="0" w:after="0"/>
-      <w:ind w:firstLine="419"/>
     </w:pPr>
   </w:style>
   <w:style w:type="paragraph" w:customStyle="1" w:styleId="Compact">
@@ -583,9 +583,9 @@
     <w:basedOn w:val="BodyText"/>
     <w:qFormat/>
     <w:pPr>
+      <w:ind/>
       <w:jc w:val="both"/>
       <w:spacing w:line="300" w:lineRule="auto" w:before="0" w:after="0"/>
-      <w:ind/>
     </w:pPr>
     <w:rPr>
       <w:rFonts w:ascii="Times New Roman" w:hAnsi="Times New Roman" w:eastAsia="SimSun" w:cs="Times New Roman"/>
@@ -604,9 +604,9 @@
     <w:rsid w:val="00A10FD9"/>
     <w:pPr>
       <w:contextualSpacing/>
+      <w:ind/>
       <w:jc w:val="center"/>
       <w:spacing w:line="360" w:lineRule="auto" w:before="240" w:after="120"/>
-      <w:ind/>
     </w:pPr>
     <w:rPr>
       <w:rFonts w:ascii="Times New Roman" w:hAnsi="Times New Roman" w:eastAsia="SimHei" w:cs="Times New Roman"/>
@@ -645,9 +645,9 @@
       <w:numPr>
         <w:ilvl w:val="1"/>
       </w:numPr>
+      <w:ind/>
       <w:jc w:val="center"/>
       <w:spacing w:line="300" w:lineRule="auto" w:before="0" w:after="120"/>
-      <w:ind/>
     </w:pPr>
     <w:rPr>
       <w:rFonts w:ascii="Times New Roman" w:hAnsi="Times New Roman" w:eastAsia="SimHei" w:cs="Times New Roman"/>
@@ -678,9 +678,9 @@
     <w:next w:val="BodyText"/>
     <w:qFormat/>
     <w:pPr>
+      <w:ind/>
       <w:jc w:val="center"/>
       <w:spacing w:line="300" w:lineRule="auto" w:before="0" w:after="0"/>
-      <w:ind/>
     </w:pPr>
     <w:rPr>
       <w:rFonts w:ascii="Times New Roman" w:hAnsi="Times New Roman" w:eastAsia="SimSun" w:cs="Times New Roman"/>
@@ -695,9 +695,9 @@
     <w:next w:val="BodyText"/>
     <w:qFormat/>
     <w:pPr>
+      <w:ind/>
       <w:jc w:val="center"/>
       <w:spacing w:line="300" w:lineRule="auto" w:before="0" w:after="0"/>
-      <w:ind/>
     </w:pPr>
     <w:rPr>
       <w:rFonts w:ascii="Times New Roman" w:hAnsi="Times New Roman" w:eastAsia="SimSun" w:cs="Times New Roman"/>
@@ -744,9 +744,9 @@
     <w:next w:val="Bibliography"/>
     <w:qFormat/>
     <w:pPr>
+      <w:ind/>
       <w:jc w:val="both"/>
       <w:spacing w:line="300" w:lineRule="auto" w:before="0" w:after="0"/>
-      <w:ind/>
     </w:pPr>
     <w:rPr>
       <w:rFonts w:ascii="Times New Roman" w:hAnsi="Times New Roman" w:eastAsia="SimSun" w:cs="Times New Roman"/>
@@ -765,9 +765,9 @@
     <w:rsid w:val="00A10FD9"/>
     <w:pPr>
       <w:outlineLvl w:val="0"/>
+      <w:ind/>
       <w:jc w:val="center"/>
       <w:spacing w:line="360" w:lineRule="auto" w:before="240" w:after="120"/>
-      <w:ind/>
     </w:pPr>
     <w:rPr>
       <w:rFonts w:ascii="Times New Roman" w:hAnsi="Times New Roman" w:eastAsia="SimHei" w:cs="Times New Roman"/>
@@ -790,9 +790,9 @@
     <w:rsid w:val="00A10FD9"/>
     <w:pPr>
       <w:outlineLvl w:val="1"/>
+      <w:ind/>
       <w:jc w:val="left"/>
       <w:spacing w:line="360" w:lineRule="auto" w:before="160" w:after="80"/>
-      <w:ind/>
     </w:pPr>
     <w:rPr>
       <w:rFonts w:ascii="Times New Roman" w:hAnsi="Times New Roman" w:eastAsia="SimHei" w:cs="Times New Roman"/>
@@ -815,9 +815,9 @@
     <w:rsid w:val="00A10FD9"/>
     <w:pPr>
       <w:outlineLvl w:val="2"/>
+      <w:ind/>
       <w:jc w:val="left"/>
       <w:spacing w:line="300" w:lineRule="auto" w:before="120" w:after="60"/>
-      <w:ind/>
     </w:pPr>
     <w:rPr>
       <w:rFonts w:ascii="Times New Roman" w:hAnsi="Times New Roman" w:eastAsia="SimHei" w:cs="Times New Roman"/>
@@ -840,9 +840,9 @@
     <w:rsid w:val="00A10FD9"/>
     <w:pPr>
       <w:outlineLvl w:val="3"/>
+      <w:ind/>
       <w:jc w:val="left"/>
       <w:spacing w:line="240" w:lineRule="auto" w:before="120" w:after="60"/>
-      <w:ind/>
     </w:pPr>
     <w:rPr>
       <w:rFonts w:ascii="Times New Roman" w:hAnsi="Times New Roman" w:eastAsia="SimHei" w:cs="Times New Roman"/>
@@ -867,9 +867,9 @@
     <w:rsid w:val="00A10FD9"/>
     <w:pPr>
       <w:outlineLvl w:val="4"/>
+      <w:ind/>
       <w:jc w:val="left"/>
       <w:spacing w:line="240" w:lineRule="auto" w:before="120" w:after="60"/>
-      <w:ind/>
     </w:pPr>
     <w:rPr>
       <w:rFonts w:ascii="Times New Roman" w:hAnsi="Times New Roman" w:eastAsia="SimHei" w:cs="Times New Roman"/>
@@ -892,9 +892,9 @@
     <w:rsid w:val="00A10FD9"/>
     <w:pPr>
       <w:outlineLvl w:val="5"/>
+      <w:ind/>
       <w:jc w:val="left"/>
       <w:spacing w:line="240" w:lineRule="auto" w:before="120" w:after="60"/>
-      <w:ind/>
     </w:pPr>
     <w:rPr>
       <w:rFonts w:ascii="Times New Roman" w:hAnsi="Times New Roman" w:eastAsia="SimHei" w:cs="Times New Roman"/>
@@ -919,9 +919,9 @@
     <w:rsid w:val="00A10FD9"/>
     <w:pPr>
       <w:outlineLvl w:val="6"/>
+      <w:ind/>
       <w:jc w:val="left"/>
       <w:spacing w:line="240" w:lineRule="auto" w:before="120" w:after="60"/>
-      <w:ind/>
     </w:pPr>
     <w:rPr>
       <w:rFonts w:ascii="Times New Roman" w:hAnsi="Times New Roman" w:eastAsia="SimHei" w:cs="Times New Roman"/>
@@ -944,9 +944,9 @@
     <w:rsid w:val="00A10FD9"/>
     <w:pPr>
       <w:outlineLvl w:val="7"/>
+      <w:ind/>
       <w:jc w:val="left"/>
       <w:spacing w:line="240" w:lineRule="auto" w:before="120" w:after="60"/>
-      <w:ind/>
     </w:pPr>
     <w:rPr>
       <w:rFonts w:ascii="Times New Roman" w:hAnsi="Times New Roman" w:eastAsia="SimHei" w:cs="Times New Roman"/>
@@ -971,9 +971,9 @@
     <w:rsid w:val="00A10FD9"/>
     <w:pPr>
       <w:outlineLvl w:val="8"/>
+      <w:ind/>
       <w:jc w:val="left"/>
       <w:spacing w:line="240" w:lineRule="auto" w:before="120" w:after="60"/>
-      <w:ind/>
     </w:pPr>
     <w:rPr>
       <w:rFonts w:ascii="Times New Roman" w:hAnsi="Times New Roman" w:eastAsia="SimHei" w:cs="Times New Roman"/>
@@ -1208,9 +1208,9 @@
     <w:basedOn w:val="Normal"/>
     <w:link w:val="BodyTextChar"/>
     <w:pPr>
+      <w:ind/>
       <w:jc w:val="center"/>
       <w:spacing w:line="300" w:lineRule="auto" w:before="120" w:after="60"/>
-      <w:ind/>
     </w:pPr>
     <w:rPr>
       <w:i/>
@@ -1226,9 +1226,9 @@
     <w:name w:val="Table Caption"/>
     <w:basedOn w:val="Caption"/>
     <w:pPr>
+      <w:ind/>
       <w:jc w:val="center"/>
       <w:spacing w:line="300" w:lineRule="auto" w:before="120" w:after="60"/>
-      <w:ind/>
     </w:pPr>
     <w:rPr>
       <w:rFonts w:ascii="Times New Roman" w:hAnsi="Times New Roman" w:eastAsia="SimSun" w:cs="Times New Roman"/>
@@ -1251,9 +1251,9 @@
       <w:color w:val="000000"/>
     </w:rPr>
     <w:pPr>
+      <w:ind/>
       <w:jc w:val="center"/>
       <w:spacing w:line="300" w:lineRule="auto" w:before="120" w:after="60"/>
-      <w:ind/>
     </w:pPr>
   </w:style>
   <w:style w:type="paragraph" w:customStyle="1" w:styleId="Figure">

</xml_diff>

<commit_message>
Migrate workflow to DeepSeek Harness 4.1
- Add AGENTS.md session contract; rewrite README/wiki for DSH
- Add docs/agent-workflow.md and mathmodel-pipeline skill
- Replace Brave/GitHub MCP research protocol with native web_search/web_fetch
- ai_assistant: fix missing project_path import, add offline --print-prompt
- build_reference: inject A4 page setup + footer PAGE field, fix rels namespace, idempotent
- init_project: workspace contract checks; bump version to 4.1
- Remove Claude leftovers (.claude/, skills-lock.json, reference.docx.bak)
</commit_message>
<xml_diff>
--- a/templates/reference.docx
+++ b/templates/reference.docx
@@ -1,6 +1,6 @@
 
 <file path=word/document.xml><?xml version="1.0" encoding="utf-8"?>
-<w:document xmlns:w="http://schemas.openxmlformats.org/wordprocessingml/2006/main" xmlns:m="http://schemas.openxmlformats.org/officeDocument/2006/math" xmlns:r="http://schemas.openxmlformats.org/officeDocument/2006/relationships" xmlns:o="urn:schemas-microsoft-com:office:office" xmlns:v="urn:schemas-microsoft-com:vml" xmlns:w10="urn:schemas-microsoft-com:office:word" xmlns:a="http://schemas.openxmlformats.org/drawingml/2006/main" xmlns:pic="http://schemas.openxmlformats.org/drawingml/2006/picture" xmlns:wp="http://schemas.openxmlformats.org/drawingml/2006/wordprocessingDrawing">
+<w:document xmlns:r="http://schemas.openxmlformats.org/officeDocument/2006/relationships" xmlns:w="http://schemas.openxmlformats.org/wordprocessingml/2006/main">
   <w:body>
     <w:p>
       <w:pPr>
@@ -314,9 +314,12 @@
       </w:r>
     </w:p>
     <w:sectPr>
+      <w:footerReference w:type="default" r:id="rId31"/>
       <w:footnotePr>
         <w:numRestart w:val="eachSect"/>
       </w:footnotePr>
+      <w:pgSz w:w="11906" w:h="16838"/>
+      <w:pgMar w:top="1417" w:right="1417" w:bottom="1417" w:left="1417" w:header="720" w:footer="720" w:gutter="0"/>
     </w:sectPr>
   </w:body>
 </w:document>

</xml_diff>